<commit_message>
vault backup: 2026-04-15 21:03:18
</commit_message>
<xml_diff>
--- a/工作日志.docx
+++ b/工作日志.docx
@@ -644,6 +644,80 @@
         <w:t>本轮修复的核心并不是“把所有文件重新命名一遍”，而是重新厘清并恢复这套项目的真实运作逻辑：Obsidian 负责源码写作，附件目录跟着文章文件名走，file- 时间戳命名是合法且稳定的，Hexo 在构建期负责适配，permalink 负责兜住线上地址稳定性。只要长期坚持这套规则，后面维护成本会明显下降。</w:t>
       </w:r>
     </w:p>
+    <w:p>
+      <w:pPr>
+        <w:pStyle w:val="Heading1"/>
+      </w:pPr>
+      <w:r>
+        <w:t>六、后续补记（2026-04-15：Obsidian 插件自动补尖括号）</w:t>
+      </w:r>
+    </w:p>
+    <w:p>
+      <w:r>
+        <w:rPr>
+          <w:b/>
+        </w:rPr>
+        <w:t>补充背景：</w:t>
+      </w:r>
+      <w:r>
+        <w:t>虽然前面已经把已有文章中的问题链接修好，但单靠当前 Obsidian 插件配置并不能保证以后新插入的附件链接自动写成 ![](&lt;文章名/file-xxxx.png&gt;) 这种安全形式，因为 data.json 中的 markdownUrlFormat 只负责生成路径模板，不负责直接生成带尖括号的整段 Markdown。</w:t>
+      </w:r>
+    </w:p>
+    <w:p>
+      <w:r>
+        <w:rPr>
+          <w:b/>
+        </w:rPr>
+        <w:t>本次新增处理：</w:t>
+      </w:r>
+      <w:r>
+        <w:t>已在 D:\TheBlogs\.obsidian\plugins\obsidian-custom-attachment-location\main.js 中补入自动逻辑：当插件准备插入的本地附件路径中包含空格时，自动输出带尖括号的 Markdown 链接；当路径不含空格时，仍保持原有写法。这样既保留现有项目逻辑，又避免用户以后手工补 &lt;...&gt;。</w:t>
+      </w:r>
+    </w:p>
+    <w:p>
+      <w:r>
+        <w:rPr>
+          <w:b/>
+        </w:rPr>
+        <w:t>补丁边界：</w:t>
+      </w:r>
+      <w:r>
+        <w:t>该修改属于对本地插件 bundle 的补丁，不是 data.json 级别的纯配置，因此如果后续升级 obsidian-custom-attachment-location 插件，这段自动处理逻辑可能被覆盖。升级后应重新核对该逻辑是否仍然存在。</w:t>
+      </w:r>
+    </w:p>
+    <w:p>
+      <w:r>
+        <w:rPr>
+          <w:b/>
+        </w:rPr>
+        <w:t>全仓库复查结果：</w:t>
+      </w:r>
+      <w:r>
+        <w:t>已对 D:\TheBlogs 中参与维护的 Markdown 文件做进一步扫描，检查所有“本地链接目标里含空格但未用尖括号包裹”的情况。补修后结果为 0，说明这类已知兼容性问题当前已清空。</w:t>
+      </w:r>
+    </w:p>
+    <w:p>
+      <w:r>
+        <w:rPr>
+          <w:b/>
+        </w:rPr>
+        <w:t>本次补修的剩余文件：</w:t>
+      </w:r>
+      <w:r>
+        <w:t>D:\TheBlogs\source\_posts\Capture_The_Flag_夺旗赛\夺旗赛Write-up\2025 警铮杯.md。该文件中 2 个仍未包裹尖括号的本地附件链接（.txt 与 .zip）已统一改正。</w:t>
+      </w:r>
+    </w:p>
+    <w:p>
+      <w:r>
+        <w:rPr>
+          <w:b/>
+        </w:rPr>
+        <w:t>维护结论更新：</w:t>
+      </w:r>
+      <w:r>
+        <w:t>现在这套项目在“旧文章已补平 + 新插图自动安全输出”两方面都已经闭环。后续若再次出现 Obsidian 提示“未创建，点击创建”之类现象，优先检查的不是附件有没有丢，而是该链接是否属于新场景、是否被插件升级覆盖、或者是否出现了新的特殊链接格式。</w:t>
+      </w:r>
+    </w:p>
     <w:sectPr>
       <w:footerReference w:type="default" r:id="rId9"/>
       <w:pgSz w:w="12240" w:h="15840"/>

</xml_diff>